<commit_message>
Update changelog version, scores and examples
</commit_message>
<xml_diff>
--- a/examples/balance-sheet/output.docx
+++ b/examples/balance-sheet/output.docx
@@ -22,7 +22,7 @@
     <w:p>
       <w:pPr>
         <w:pStyle w:val="Heading1"/>
-        <w:spacing w:after="60" w:line="546" w:lineRule="atLeast"/>
+        <w:spacing w:after="60" w:before="195" w:line="546" w:lineRule="atLeast"/>
         <w:textAlignment w:val="center"/>
       </w:pPr>
       <w:r>
@@ -149,7 +149,6 @@
             <w:r>
               <w:rPr>
                 <w:rFonts w:ascii="Georgia" w:cs="Georgia" w:eastAsia="Georgia" w:hAnsi="Georgia"/>
-                <w:color w:val="111111"/>
                 <w:sz w:val="20"/>
                 <w:szCs w:val="20"/>
               </w:rPr>
@@ -175,7 +174,6 @@
             <w:r>
               <w:rPr>
                 <w:rFonts w:ascii="Georgia" w:cs="Georgia" w:eastAsia="Georgia" w:hAnsi="Georgia"/>
-                <w:color w:val="111111"/>
                 <w:sz w:val="20"/>
                 <w:szCs w:val="20"/>
               </w:rPr>
@@ -202,7 +200,6 @@
             <w:r>
               <w:rPr>
                 <w:rFonts w:ascii="Georgia" w:cs="Georgia" w:eastAsia="Georgia" w:hAnsi="Georgia"/>
-                <w:color w:val="111111"/>
                 <w:sz w:val="20"/>
                 <w:szCs w:val="20"/>
               </w:rPr>
@@ -228,7 +225,6 @@
             <w:r>
               <w:rPr>
                 <w:rFonts w:ascii="Georgia" w:cs="Georgia" w:eastAsia="Georgia" w:hAnsi="Georgia"/>
-                <w:color w:val="111111"/>
                 <w:sz w:val="20"/>
                 <w:szCs w:val="20"/>
               </w:rPr>
@@ -255,7 +251,6 @@
             <w:r>
               <w:rPr>
                 <w:rFonts w:ascii="Georgia" w:cs="Georgia" w:eastAsia="Georgia" w:hAnsi="Georgia"/>
-                <w:color w:val="111111"/>
                 <w:sz w:val="20"/>
                 <w:szCs w:val="20"/>
               </w:rPr>
@@ -281,7 +276,6 @@
             <w:r>
               <w:rPr>
                 <w:rFonts w:ascii="Georgia" w:cs="Georgia" w:eastAsia="Georgia" w:hAnsi="Georgia"/>
-                <w:color w:val="111111"/>
                 <w:sz w:val="20"/>
                 <w:szCs w:val="20"/>
               </w:rPr>
@@ -311,7 +305,6 @@
                 <w:rFonts w:ascii="Georgia" w:cs="Georgia" w:eastAsia="Georgia" w:hAnsi="Georgia"/>
                 <w:b/>
                 <w:bCs/>
-                <w:color w:val="111111"/>
                 <w:sz w:val="20"/>
                 <w:szCs w:val="20"/>
               </w:rPr>
@@ -340,7 +333,6 @@
                 <w:rFonts w:ascii="Georgia" w:cs="Georgia" w:eastAsia="Georgia" w:hAnsi="Georgia"/>
                 <w:b/>
                 <w:bCs/>
-                <w:color w:val="111111"/>
                 <w:sz w:val="20"/>
                 <w:szCs w:val="20"/>
               </w:rPr>
@@ -367,7 +359,6 @@
             <w:r>
               <w:rPr>
                 <w:rFonts w:ascii="Georgia" w:cs="Georgia" w:eastAsia="Georgia" w:hAnsi="Georgia"/>
-                <w:color w:val="111111"/>
                 <w:sz w:val="20"/>
                 <w:szCs w:val="20"/>
               </w:rPr>
@@ -393,7 +384,6 @@
             <w:r>
               <w:rPr>
                 <w:rFonts w:ascii="Georgia" w:cs="Georgia" w:eastAsia="Georgia" w:hAnsi="Georgia"/>
-                <w:color w:val="111111"/>
                 <w:sz w:val="20"/>
                 <w:szCs w:val="20"/>
               </w:rPr>
@@ -420,7 +410,6 @@
             <w:r>
               <w:rPr>
                 <w:rFonts w:ascii="Georgia" w:cs="Georgia" w:eastAsia="Georgia" w:hAnsi="Georgia"/>
-                <w:color w:val="111111"/>
                 <w:sz w:val="20"/>
                 <w:szCs w:val="20"/>
               </w:rPr>
@@ -446,7 +435,6 @@
             <w:r>
               <w:rPr>
                 <w:rFonts w:ascii="Georgia" w:cs="Georgia" w:eastAsia="Georgia" w:hAnsi="Georgia"/>
-                <w:color w:val="111111"/>
                 <w:sz w:val="20"/>
                 <w:szCs w:val="20"/>
               </w:rPr>
@@ -476,7 +464,6 @@
                 <w:rFonts w:ascii="Georgia" w:cs="Georgia" w:eastAsia="Georgia" w:hAnsi="Georgia"/>
                 <w:b/>
                 <w:bCs/>
-                <w:color w:val="111111"/>
                 <w:sz w:val="20"/>
                 <w:szCs w:val="20"/>
               </w:rPr>
@@ -505,7 +492,6 @@
                 <w:rFonts w:ascii="Georgia" w:cs="Georgia" w:eastAsia="Georgia" w:hAnsi="Georgia"/>
                 <w:b/>
                 <w:bCs/>
-                <w:color w:val="111111"/>
                 <w:sz w:val="20"/>
                 <w:szCs w:val="20"/>
               </w:rPr>
@@ -621,7 +607,6 @@
             <w:r>
               <w:rPr>
                 <w:rFonts w:ascii="Georgia" w:cs="Georgia" w:eastAsia="Georgia" w:hAnsi="Georgia"/>
-                <w:color w:val="111111"/>
                 <w:sz w:val="20"/>
                 <w:szCs w:val="20"/>
               </w:rPr>
@@ -647,7 +632,6 @@
             <w:r>
               <w:rPr>
                 <w:rFonts w:ascii="Georgia" w:cs="Georgia" w:eastAsia="Georgia" w:hAnsi="Georgia"/>
-                <w:color w:val="111111"/>
                 <w:sz w:val="20"/>
                 <w:szCs w:val="20"/>
               </w:rPr>
@@ -674,7 +658,6 @@
             <w:r>
               <w:rPr>
                 <w:rFonts w:ascii="Georgia" w:cs="Georgia" w:eastAsia="Georgia" w:hAnsi="Georgia"/>
-                <w:color w:val="111111"/>
                 <w:sz w:val="20"/>
                 <w:szCs w:val="20"/>
               </w:rPr>
@@ -700,7 +683,6 @@
             <w:r>
               <w:rPr>
                 <w:rFonts w:ascii="Georgia" w:cs="Georgia" w:eastAsia="Georgia" w:hAnsi="Georgia"/>
-                <w:color w:val="111111"/>
                 <w:sz w:val="20"/>
                 <w:szCs w:val="20"/>
               </w:rPr>
@@ -727,7 +709,6 @@
             <w:r>
               <w:rPr>
                 <w:rFonts w:ascii="Georgia" w:cs="Georgia" w:eastAsia="Georgia" w:hAnsi="Georgia"/>
-                <w:color w:val="111111"/>
                 <w:sz w:val="20"/>
                 <w:szCs w:val="20"/>
               </w:rPr>
@@ -753,7 +734,6 @@
             <w:r>
               <w:rPr>
                 <w:rFonts w:ascii="Georgia" w:cs="Georgia" w:eastAsia="Georgia" w:hAnsi="Georgia"/>
-                <w:color w:val="111111"/>
                 <w:sz w:val="20"/>
                 <w:szCs w:val="20"/>
               </w:rPr>
@@ -783,7 +763,6 @@
                 <w:rFonts w:ascii="Georgia" w:cs="Georgia" w:eastAsia="Georgia" w:hAnsi="Georgia"/>
                 <w:b/>
                 <w:bCs/>
-                <w:color w:val="111111"/>
                 <w:sz w:val="20"/>
                 <w:szCs w:val="20"/>
               </w:rPr>
@@ -812,7 +791,6 @@
                 <w:rFonts w:ascii="Georgia" w:cs="Georgia" w:eastAsia="Georgia" w:hAnsi="Georgia"/>
                 <w:b/>
                 <w:bCs/>
-                <w:color w:val="111111"/>
                 <w:sz w:val="20"/>
                 <w:szCs w:val="20"/>
               </w:rPr>
@@ -839,7 +817,6 @@
             <w:r>
               <w:rPr>
                 <w:rFonts w:ascii="Georgia" w:cs="Georgia" w:eastAsia="Georgia" w:hAnsi="Georgia"/>
-                <w:color w:val="111111"/>
                 <w:sz w:val="20"/>
                 <w:szCs w:val="20"/>
               </w:rPr>
@@ -865,7 +842,6 @@
             <w:r>
               <w:rPr>
                 <w:rFonts w:ascii="Georgia" w:cs="Georgia" w:eastAsia="Georgia" w:hAnsi="Georgia"/>
-                <w:color w:val="111111"/>
                 <w:sz w:val="20"/>
                 <w:szCs w:val="20"/>
               </w:rPr>
@@ -892,7 +868,6 @@
             <w:r>
               <w:rPr>
                 <w:rFonts w:ascii="Georgia" w:cs="Georgia" w:eastAsia="Georgia" w:hAnsi="Georgia"/>
-                <w:color w:val="111111"/>
                 <w:sz w:val="20"/>
                 <w:szCs w:val="20"/>
               </w:rPr>
@@ -918,7 +893,6 @@
             <w:r>
               <w:rPr>
                 <w:rFonts w:ascii="Georgia" w:cs="Georgia" w:eastAsia="Georgia" w:hAnsi="Georgia"/>
-                <w:color w:val="111111"/>
                 <w:sz w:val="20"/>
                 <w:szCs w:val="20"/>
               </w:rPr>
@@ -948,7 +922,6 @@
                 <w:rFonts w:ascii="Georgia" w:cs="Georgia" w:eastAsia="Georgia" w:hAnsi="Georgia"/>
                 <w:b/>
                 <w:bCs/>
-                <w:color w:val="111111"/>
                 <w:sz w:val="20"/>
                 <w:szCs w:val="20"/>
               </w:rPr>
@@ -977,7 +950,6 @@
                 <w:rFonts w:ascii="Georgia" w:cs="Georgia" w:eastAsia="Georgia" w:hAnsi="Georgia"/>
                 <w:b/>
                 <w:bCs/>
-                <w:color w:val="111111"/>
                 <w:sz w:val="20"/>
                 <w:szCs w:val="20"/>
               </w:rPr>
@@ -1004,7 +976,6 @@
             <w:r>
               <w:rPr>
                 <w:rFonts w:ascii="Georgia" w:cs="Georgia" w:eastAsia="Georgia" w:hAnsi="Georgia"/>
-                <w:color w:val="111111"/>
                 <w:sz w:val="20"/>
                 <w:szCs w:val="20"/>
               </w:rPr>
@@ -1030,7 +1001,6 @@
             <w:r>
               <w:rPr>
                 <w:rFonts w:ascii="Georgia" w:cs="Georgia" w:eastAsia="Georgia" w:hAnsi="Georgia"/>
-                <w:color w:val="111111"/>
                 <w:sz w:val="20"/>
                 <w:szCs w:val="20"/>
               </w:rPr>
@@ -1057,7 +1027,6 @@
             <w:r>
               <w:rPr>
                 <w:rFonts w:ascii="Georgia" w:cs="Georgia" w:eastAsia="Georgia" w:hAnsi="Georgia"/>
-                <w:color w:val="111111"/>
                 <w:sz w:val="20"/>
                 <w:szCs w:val="20"/>
               </w:rPr>
@@ -1083,7 +1052,6 @@
             <w:r>
               <w:rPr>
                 <w:rFonts w:ascii="Georgia" w:cs="Georgia" w:eastAsia="Georgia" w:hAnsi="Georgia"/>
-                <w:color w:val="111111"/>
                 <w:sz w:val="20"/>
                 <w:szCs w:val="20"/>
               </w:rPr>
@@ -1110,7 +1078,6 @@
             <w:r>
               <w:rPr>
                 <w:rFonts w:ascii="Georgia" w:cs="Georgia" w:eastAsia="Georgia" w:hAnsi="Georgia"/>
-                <w:color w:val="111111"/>
                 <w:sz w:val="20"/>
                 <w:szCs w:val="20"/>
               </w:rPr>
@@ -1136,7 +1103,6 @@
             <w:r>
               <w:rPr>
                 <w:rFonts w:ascii="Georgia" w:cs="Georgia" w:eastAsia="Georgia" w:hAnsi="Georgia"/>
-                <w:color w:val="111111"/>
                 <w:sz w:val="20"/>
                 <w:szCs w:val="20"/>
               </w:rPr>
@@ -1166,7 +1132,6 @@
                 <w:rFonts w:ascii="Georgia" w:cs="Georgia" w:eastAsia="Georgia" w:hAnsi="Georgia"/>
                 <w:b/>
                 <w:bCs/>
-                <w:color w:val="111111"/>
                 <w:sz w:val="20"/>
                 <w:szCs w:val="20"/>
               </w:rPr>
@@ -1195,7 +1160,6 @@
                 <w:rFonts w:ascii="Georgia" w:cs="Georgia" w:eastAsia="Georgia" w:hAnsi="Georgia"/>
                 <w:b/>
                 <w:bCs/>
-                <w:color w:val="111111"/>
                 <w:sz w:val="20"/>
                 <w:szCs w:val="20"/>
               </w:rPr>
@@ -1225,7 +1189,6 @@
                 <w:rFonts w:ascii="Georgia" w:cs="Georgia" w:eastAsia="Georgia" w:hAnsi="Georgia"/>
                 <w:b/>
                 <w:bCs/>
-                <w:color w:val="111111"/>
                 <w:sz w:val="20"/>
                 <w:szCs w:val="20"/>
               </w:rPr>
@@ -1254,7 +1217,6 @@
                 <w:rFonts w:ascii="Georgia" w:cs="Georgia" w:eastAsia="Georgia" w:hAnsi="Georgia"/>
                 <w:b/>
                 <w:bCs/>
-                <w:color w:val="111111"/>
                 <w:sz w:val="20"/>
                 <w:szCs w:val="20"/>
               </w:rPr>
@@ -1291,7 +1253,7 @@
         </w:rPr>
         <w:t xml:space="preserve"> </w:t>
       </w:r>
-      <w:hyperlink w:history="1" r:id="rIdbtwyg0lpdpwo8o0w3iohu">
+      <w:hyperlink w:history="1" r:id="rIdn7l6uoona2cdnf7ncyhex">
         <w:r>
           <w:rPr>
             <w:rStyle w:val="Hyperlink"/>

</xml_diff>